<commit_message>
Fase 4: motor NTT/INTT completo — corrige 3 bugs (in-place, fórmula GS, constante INV128), round-trip verificado
</commit_message>
<xml_diff>
--- a/docs/isa_vectorial_kyber.docx
+++ b/docs/isa_vectorial_kyber.docx
@@ -3824,7 +3824,7 @@
           <w:sz w:val="21"/>
           <w:szCs w:val="21"/>
         </w:rPr>
-        <w:t xml:space="preserve">Para cada par (a, b), con twiddle factor inverso ζ⁻¹:</w:t>
+        <w:t xml:space="preserve">Para cada par (a, b), con twiddle factor ζ (el MISMO valor que usa vntt para esa posición — ver nota de corrección):</w:t>
       </w:r>
     </w:p>
     <w:p>
@@ -3854,7 +3854,32 @@
           <w:sz w:val="20"/>
           <w:szCs w:val="20"/>
         </w:rPr>
-        <w:t xml:space="preserve">b' = ζ⁻¹·(a - b)    (mod q)</w:t>
+        <w:t xml:space="preserve">b' = ζ·(b - a)      (mod q)</w:t>
+      </w:r>
+    </w:p>
+    <w:p>
+      <w:pPr>
+        <w:spacing w:after="150" w:before="100"/>
+      </w:pPr>
+      <w:r>
+        <w:rPr>
+          <w:b/>
+          <w:bCs/>
+          <w:color w:val="B33A3A"/>
+          <w:sz w:val="21"/>
+          <w:szCs w:val="21"/>
+        </w:rPr>
+        <w:t xml:space="preserve">Corrección (Fase 4): </w:t>
+      </w:r>
+      <w:r>
+        <w:rPr>
+          <w:i/>
+          <w:iCs/>
+          <w:color w:val="6B6B6B"/>
+          <w:sz w:val="20"/>
+          <w:szCs w:val="20"/>
+        </w:rPr>
+        <w:t xml:space="preserve">la versión original de esta sección especificaba "twiddle factor inverso ζ⁻¹" y la resta como (a − b), siguiendo la convención académica estándar de FFT/NTT (donde GS usa el twiddle inverso de CT). Al integrar y verificar el motor NTT completo contra el modelo de referencia (models/kyber_ref.py, ya validado contra kyber-py en esta misma fase), se detectó que la implementación real de Kyber (pq-crystals/kyber) NO invierte el twiddle — usa el mismo ζ que Cooley-Tukey — y que el orden de la resta es (b − a), no (a − b). Ambas correcciones se confirmaron exhaustivamente: los 256 coeficientes del round-trip INTT(NTT(x)) coinciden exactamente con x solo con esta fórmula corregida. Ver rtl/vector/butterfly_gs.sv para el detalle completo y el razonamiento del debug.</w:t>
       </w:r>
     </w:p>
     <w:p>

</xml_diff>